<commit_message>
updated docs for final printout
</commit_message>
<xml_diff>
--- a/Documentation/Blackbook/1. firstpage.docx
+++ b/Documentation/Blackbook/1. firstpage.docx
@@ -533,7 +533,7 @@
           <w:szCs w:val="40"/>
           <w:lang w:val="en-IN"/>
         </w:rPr>
-        <w:t>Prof. (Dr</w:t>
+        <w:t xml:space="preserve">Dr. </w:t>
       </w:r>
       <w:bookmarkStart w:id="0" w:name="_GoBack"/>
       <w:bookmarkEnd w:id="0"/>
@@ -545,7 +545,7 @@
           <w:szCs w:val="40"/>
           <w:lang w:val="en-IN"/>
         </w:rPr>
-        <w:t>.) Santosh Deshmukh</w:t>
+        <w:t>Santosh Deshmukh</w:t>
       </w:r>
     </w:p>
     <w:p>

</xml_diff>